<commit_message>
Update project report and Word document with expanded academic references
</commit_message>
<xml_diff>
--- a/2026-1_IoT네트워크_Project_결과보고서.docx
+++ b/2026-1_IoT네트워크_Project_결과보고서.docx
@@ -2857,6 +2857,66 @@
         <w:t>[5] Arduino PubSubClient Library - ESP32S3 무선 통신 및 non-blocking 연결 상태 머신 구현</w:t>
       </w:r>
     </w:p>
+    <w:p>
+      <w:pPr>
+        <w:spacing w:after="120" w:line="312" w:lineRule="auto"/>
+      </w:pPr>
+      <w:r>
+        <w:rPr>
+          <w:rFonts w:ascii="맑은 고딕" w:hAnsi="맑은 고딕"/>
+          <w:sz w:val="20"/>
+        </w:rPr>
+        <w:t>[6] org.jsoup (Jsoup Java HTML Parser) - 공식 API 레퍼런스 및 XML/HTML DOM 파싱 명세</w:t>
+      </w:r>
+    </w:p>
+    <w:p>
+      <w:pPr>
+        <w:spacing w:after="120" w:line="312" w:lineRule="auto"/>
+      </w:pPr>
+      <w:r>
+        <w:rPr>
+          <w:rFonts w:ascii="맑은 고딕" w:hAnsi="맑은 고딕"/>
+          <w:sz w:val="20"/>
+        </w:rPr>
+        <w:t>[7] ESP32Servo Library (Kevin Harrington) - ESP32S3 마이크로컨트롤러 환경의 PWM 주파수 매칭 및 SG90 서보 제어 가이드</w:t>
+      </w:r>
+    </w:p>
+    <w:p>
+      <w:pPr>
+        <w:spacing w:after="120" w:line="312" w:lineRule="auto"/>
+      </w:pPr>
+      <w:r>
+        <w:rPr>
+          <w:rFonts w:ascii="맑은 고딕" w:hAnsi="맑은 고딕"/>
+          <w:sz w:val="20"/>
+        </w:rPr>
+        <w:t>[8] LiquidCrystal_I2C Library (Frank de Brabander) - PCF8574 I2C 인터페이스를 활용한 LCD 1602 문자 출력 및 백라이트 제어</w:t>
+      </w:r>
+    </w:p>
+    <w:p>
+      <w:pPr>
+        <w:spacing w:after="120" w:line="312" w:lineRule="auto"/>
+      </w:pPr>
+      <w:r>
+        <w:rPr>
+          <w:rFonts w:ascii="맑은 고딕" w:hAnsi="맑은 고딕"/>
+          <w:sz w:val="20"/>
+        </w:rPr>
+        <w:t>[9] OASIS MQTT v3.1.1 Specification - MQTT 프로토콜 헤더 구조 및 QoS 레벨 정의 공식 문서</w:t>
+      </w:r>
+    </w:p>
+    <w:p>
+      <w:pPr>
+        <w:spacing w:after="120" w:line="312" w:lineRule="auto"/>
+      </w:pPr>
+      <w:r>
+        <w:rPr>
+          <w:rFonts w:ascii="맑은 고딕" w:hAnsi="맑은 고딕"/>
+          <w:sz w:val="20"/>
+        </w:rPr>
+        <w:t>[10] jQuery API Documentation (jQuery 3.x) - 이벤트 바인딩 및 비동기 소켓 응답에 따른 DOM 요소 실시간 조작 명세</w:t>
+      </w:r>
+    </w:p>
     <w:sectPr>
       <w:pgSz w:w="12240" w:h="15840"/>
       <w:pgMar w:top="1440" w:right="1440" w:bottom="1440" w:left="1440" w:header="720" w:footer="720" w:gutter="0"/>

</xml_diff>